<commit_message>
fix(briefings): correct Briefing 03 dependency paragraph and closing
DAL-X "exists" becomes "is being built" since the product is still a
simulation.

Co-Authored-By: Claude Opus 5.5 <noreply@anthropic.com>
</commit_message>
<xml_diff>
--- a/briefings-source/Strategic_Intelligence_Briefing_03.docx
+++ b/briefings-source/Strategic_Intelligence_Briefing_03.docx
@@ -495,7 +495,7 @@
         <w:rPr>
           <w:rFonts w:ascii="Aptos" w:hAnsi="Aptos"/>
         </w:rPr>
-        <w:t>This is the reason DAL-X cannot be reduced to a screen, a tracker, or a compliance worksheet. Its value depends on whether it can enforce the path between AI participation, authority condition, decision state, escalation, override, and evidence. Without that path, the enterprise may have governance material around AI, but it does not have enforceable authority over AI influenced decisions.</w:t>
+        <w:t>This is the reason DAL-X cannot be reduced to a screen, a tracker, or a compliance worksheet. Its value depends on whether the downstream system rejects an execution that lacks valid authority for the exact action. Without that rejection, the enterprise may have governance material around AI, but it does not have enforceable authority over consequential AI agent executions.</w:t>
       </w:r>
     </w:p>
     <w:p>
@@ -506,7 +506,7 @@
         <w:rPr>
           <w:rFonts w:ascii="Aptos" w:hAnsi="Aptos"/>
         </w:rPr>
-        <w:t>The next control standard will not be satisfied by more visibility alone. It will require proof that AI influenced work was reviewed, routed, authorized, restricted, or stopped before the enterprise acted. DAL-X exists for that control layer.</w:t>
+        <w:t>The next control standard will not be satisfied by more visibility alone. It will require proof that each consequential AI agent execution was authorized, escalated, or stopped before the downstream system acted. DAL-X is being built for that control layer.</w:t>
       </w:r>
     </w:p>
     <w:p>

</xml_diff>